<commit_message>
chore(diagrams,docs): sync UML diagrams, report, and presentation with new admin commands
Update diagrams 02, 08, 11, 12 and regenerate the annual report and
defense presentation to reflect the three new admin commands
(/resetuser, /clearusers, /clearledger) and the corresponding
interface additions (IUserRepository.ResetAsync/ClearAllAsync,
IUserService.ResetUserAsync/ClearAllUsersAsync,
ILedgerRepository.ClearAsync, LedgerService.ClearAsync).
</commit_message>
<xml_diff>
--- a/raport/Proiect_de_an_NurFlac.docx
+++ b/raport/Proiect_de_an_NurFlac.docx
@@ -6187,7 +6187,21 @@
           <w:rFonts w:ascii="Consolas" w:hAnsi="Consolas"/>
           <w:sz w:val="20"/>
         </w:rPr>
-        <w:t xml:space="preserve">          "\n**Admin Commands**\n/ban &lt;id&gt; ...  /timeout &lt;id&gt; &lt;h&gt; ... /unban &lt;id&gt;"</w:t>
+        <w:t xml:space="preserve">          "\n**Admin Commands**\n/ban &lt;id&gt; ... /timeout &lt;id&gt; &lt;h&gt; ... /unban &lt;id&gt;"</w:t>
+      </w:r>
+    </w:p>
+    <w:p>
+      <w:pPr>
+        <w:spacing w:before="0" w:after="0"/>
+        <w:ind w:left="283"/>
+        <w:jc w:val="left"/>
+      </w:pPr>
+      <w:r>
+        <w:rPr>
+          <w:rFonts w:ascii="Consolas" w:hAnsi="Consolas"/>
+          <w:sz w:val="20"/>
+        </w:rPr>
+        <w:t xml:space="preserve">          "\n/resetuser &lt;id&gt; ... /clearusers ... /clearledger"</w:t>
       </w:r>
     </w:p>
     <w:p>
@@ -7166,6 +7180,78 @@
           <w:sz w:val="24"/>
         </w:rPr>
         <w:t>— Ridică banul sau timeout-ul activ al utilizatorului specificat.</w:t>
+      </w:r>
+    </w:p>
+    <w:p>
+      <w:pPr>
+        <w:spacing w:before="40" w:after="40"/>
+        <w:ind w:left="283"/>
+      </w:pPr>
+      <w:r>
+        <w:rPr>
+          <w:rFonts w:ascii="Consolas" w:hAnsi="Consolas"/>
+          <w:b/>
+          <w:i w:val="0"/>
+          <w:sz w:val="20"/>
+        </w:rPr>
+        <w:t xml:space="preserve">/resetuser &lt;id&gt;  </w:t>
+      </w:r>
+      <w:r>
+        <w:rPr>
+          <w:rFonts w:ascii="Times New Roman" w:hAnsi="Times New Roman"/>
+          <w:b w:val="0"/>
+          <w:i w:val="0"/>
+          <w:sz w:val="24"/>
+        </w:rPr>
+        <w:t>— Şterge strike-urile utilizatorului şi restaurează statusul Active.</w:t>
+      </w:r>
+    </w:p>
+    <w:p>
+      <w:pPr>
+        <w:spacing w:before="40" w:after="40"/>
+        <w:ind w:left="283"/>
+      </w:pPr>
+      <w:r>
+        <w:rPr>
+          <w:rFonts w:ascii="Consolas" w:hAnsi="Consolas"/>
+          <w:b/>
+          <w:i w:val="0"/>
+          <w:sz w:val="20"/>
+        </w:rPr>
+        <w:t xml:space="preserve">/clearusers  </w:t>
+      </w:r>
+      <w:r>
+        <w:rPr>
+          <w:rFonts w:ascii="Times New Roman" w:hAnsi="Times New Roman"/>
+          <w:b w:val="0"/>
+          <w:i w:val="0"/>
+          <w:sz w:val="24"/>
+        </w:rPr>
+        <w:t>— Şterge toate înregistrările de utilizatori din baza de date.</w:t>
+      </w:r>
+    </w:p>
+    <w:p>
+      <w:pPr>
+        <w:spacing w:before="40" w:after="40"/>
+        <w:ind w:left="283"/>
+      </w:pPr>
+      <w:r>
+        <w:rPr>
+          <w:rFonts w:ascii="Consolas" w:hAnsi="Consolas"/>
+          <w:b/>
+          <w:i w:val="0"/>
+          <w:sz w:val="20"/>
+        </w:rPr>
+        <w:t xml:space="preserve">/clearledger  </w:t>
+      </w:r>
+      <w:r>
+        <w:rPr>
+          <w:rFonts w:ascii="Times New Roman" w:hAnsi="Times New Roman"/>
+          <w:b w:val="0"/>
+          <w:i w:val="0"/>
+          <w:sz w:val="24"/>
+        </w:rPr>
+        <w:t>— Şterge ledger-ul de deduplicare, permiţând re-upload-ul fişierelor.</w:t>
       </w:r>
     </w:p>
     <w:p>

</xml_diff>